<commit_message>
docs: update Sprint 1 master document with Week 3 progress
</commit_message>
<xml_diff>
--- a/docs/Master-Document-Task3-Sprint1.docx
+++ b/docs/Master-Document-Task3-Sprint1.docx
@@ -1938,19 +1938,32 @@
     </w:tbl>
     <w:p/>
     <w:p>
-      <w:r>
-        <w:rPr>
-          <w:b/>
-          <w:bCs/>
-        </w:rPr>
-        <w:t>Status: Not started</w:t>
-      </w:r>
-    </w:p>
-    <w:p>
-      <w:r>
-        <w:rPr>
-          <w:b/>
-          <w:bCs/>
+      <w:pPr>
+        <w:rPr>
+          <w:b w:val="1"/>
+          <w:bCs w:val="1"/>
+        </w:rPr>
+      </w:pPr>
+      <w:r>
+        <w:rPr>
+          <w:b w:val="1"/>
+          <w:bCs w:val="1"/>
+        </w:rPr>
+        <w:t xml:space="preserve">Status: </w:t>
+      </w:r>
+      <w:r>
+        <w:rPr>
+          <w:b w:val="1"/>
+          <w:bCs w:val="1"/>
+        </w:rPr>
+        <w:t>In progress</w:t>
+      </w:r>
+    </w:p>
+    <w:p>
+      <w:r>
+        <w:rPr>
+          <w:b w:val="1"/>
+          <w:bCs w:val="1"/>
         </w:rPr>
         <w:t xml:space="preserve">Done: </w:t>
       </w:r>
@@ -1958,19 +1971,109 @@
     <w:p>
       <w:r>
         <w:rPr>
-          <w:b/>
-          <w:bCs/>
+          <w:b w:val="1"/>
+          <w:bCs w:val="1"/>
+        </w:rPr>
+        <w:t>-Built a full wireframe prototype in Figma</w:t>
+      </w:r>
+    </w:p>
+    <w:p>
+      <w:r>
+        <w:rPr>
+          <w:b w:val="1"/>
+          <w:bCs w:val="1"/>
+        </w:rPr>
+        <w:t>-Covered all 6 BRD v2.0</w:t>
+      </w:r>
+    </w:p>
+    <w:p>
+      <w:r>
+        <w:rPr>
+          <w:b w:val="1"/>
+          <w:bCs w:val="1"/>
+        </w:rPr>
+        <w:t xml:space="preserve">-10 screen across 3 pages </w:t>
+      </w:r>
+    </w:p>
+    <w:p>
+      <w:pPr>
+        <w:pStyle w:val="Normal"/>
+      </w:pPr>
+      <w:r>
+        <w:rPr>
+          <w:b w:val="1"/>
+          <w:bCs w:val="1"/>
+        </w:rPr>
+        <w:t>-</w:t>
+      </w:r>
+      <w:r>
+        <w:rPr>
+          <w:rFonts w:ascii="Times New Roman" w:hAnsi="Times New Roman" w:eastAsia="Times New Roman" w:cs="Times New Roman"/>
+          <w:noProof w:val="0"/>
+          <w:sz w:val="20"/>
+          <w:szCs w:val="20"/>
+          <w:lang w:val="en-US"/>
+        </w:rPr>
+        <w:t xml:space="preserve"> Fields and terminology built directly from BRD v2.0 Appendix A must-have features and the six named epics.</w:t>
+      </w:r>
+    </w:p>
+    <w:p>
+      <w:pPr>
+        <w:pStyle w:val="Normal"/>
+      </w:pPr>
+      <w:r>
+        <w:rPr>
+          <w:b w:val="1"/>
+          <w:bCs w:val="1"/>
         </w:rPr>
         <w:t xml:space="preserve">Deliverable: </w:t>
       </w:r>
-    </w:p>
-    <w:p>
-      <w:r>
-        <w:rPr>
-          <w:b/>
-          <w:bCs/>
+      <w:r>
+        <w:rPr>
+          <w:rFonts w:ascii="Times New Roman" w:hAnsi="Times New Roman" w:eastAsia="Times New Roman" w:cs="Times New Roman"/>
+          <w:noProof w:val="0"/>
+          <w:sz w:val="20"/>
+          <w:szCs w:val="20"/>
+          <w:lang w:val="en-US"/>
+        </w:rPr>
+        <w:t xml:space="preserve">FSC CRM – Full Prototype (Wireframes), Figma file: </w:t>
+      </w:r>
+      <w:hyperlink r:id="R1484bac5e053443a">
+        <w:r>
+          <w:rPr>
+            <w:rStyle w:val="Hyperlink"/>
+            <w:rFonts w:ascii="Times New Roman" w:hAnsi="Times New Roman" w:eastAsia="Times New Roman" w:cs="Times New Roman"/>
+            <w:noProof w:val="0"/>
+            <w:sz w:val="20"/>
+            <w:szCs w:val="20"/>
+            <w:lang w:val="en-US"/>
+          </w:rPr>
+          <w:t>https://www.figma.com/design/UoWXTTEGMSJiVcpDZdhRtC</w:t>
+        </w:r>
+      </w:hyperlink>
+    </w:p>
+    <w:p>
+      <w:r>
+        <w:rPr>
+          <w:b w:val="1"/>
+          <w:bCs w:val="1"/>
         </w:rPr>
         <w:t xml:space="preserve">Note for next role: </w:t>
+      </w:r>
+    </w:p>
+    <w:p>
+      <w:pPr>
+        <w:spacing w:before="240" w:beforeAutospacing="off" w:after="240" w:afterAutospacing="off"/>
+      </w:pPr>
+      <w:r>
+        <w:rPr>
+          <w:rFonts w:ascii="Times New Roman" w:hAnsi="Times New Roman" w:eastAsia="Times New Roman" w:cs="Times New Roman"/>
+          <w:noProof w:val="0"/>
+          <w:sz w:val="20"/>
+          <w:szCs w:val="20"/>
+          <w:lang w:val="en-US"/>
+        </w:rPr>
+        <w:t>Low-fidelity wireframe pass, not yet a polished visual design. Field definitions are pending final confirmation from BA that the Requirements Analysis doc fully matches BRD v2.0 (see separate flag re: Epic 3/4 pipeline reference). Once confirmed, next pass adds visual polish and secondary states (empty/error/loading). Ready for Dev to review information architecture ahead of Week 3 build.</w:t>
       </w:r>
     </w:p>
     <w:p/>
@@ -2508,42 +2611,198 @@
     </w:tbl>
     <w:p/>
     <w:p>
-      <w:r>
-        <w:rPr>
-          <w:b/>
-          <w:bCs/>
-        </w:rPr>
-        <w:t>Status: Not started</w:t>
-      </w:r>
-    </w:p>
-    <w:p>
-      <w:r>
-        <w:rPr>
-          <w:b/>
-          <w:bCs/>
+      <w:pPr>
+        <w:rPr>
+          <w:b w:val="1"/>
+          <w:bCs w:val="1"/>
+        </w:rPr>
+      </w:pPr>
+      <w:r>
+        <w:rPr>
+          <w:b w:val="1"/>
+          <w:bCs w:val="1"/>
+        </w:rPr>
+        <w:t>Status:</w:t>
+      </w:r>
+      <w:r>
+        <w:rPr>
+          <w:b w:val="1"/>
+          <w:bCs w:val="1"/>
+        </w:rPr>
+        <w:t xml:space="preserve"> </w:t>
+      </w:r>
+      <w:r>
+        <w:rPr>
+          <w:b w:val="0"/>
+          <w:bCs w:val="0"/>
+        </w:rPr>
+        <w:t>Complete</w:t>
+      </w:r>
+    </w:p>
+    <w:p>
+      <w:pPr>
+        <w:rPr>
+          <w:b w:val="1"/>
+          <w:bCs w:val="1"/>
+        </w:rPr>
+      </w:pPr>
+      <w:r>
+        <w:rPr>
+          <w:b w:val="1"/>
+          <w:bCs w:val="1"/>
         </w:rPr>
         <w:t xml:space="preserve">Done: </w:t>
       </w:r>
-    </w:p>
-    <w:p>
-      <w:r>
-        <w:rPr>
-          <w:b/>
-          <w:bCs/>
+      <w:r>
+        <w:rPr>
+          <w:b w:val="0"/>
+          <w:bCs w:val="0"/>
+        </w:rPr>
+        <w:t xml:space="preserve">A health-check endpoint has been added to verify that both the server and database are up and </w:t>
+      </w:r>
+      <w:r>
+        <w:rPr>
+          <w:b w:val="0"/>
+          <w:bCs w:val="0"/>
+        </w:rPr>
+        <w:t>running,</w:t>
+      </w:r>
+      <w:r>
+        <w:rPr>
+          <w:b w:val="0"/>
+          <w:bCs w:val="0"/>
+        </w:rPr>
+        <w:t xml:space="preserve"> rather </w:t>
+      </w:r>
+      <w:r>
+        <w:rPr>
+          <w:b w:val="0"/>
+          <w:bCs w:val="0"/>
+        </w:rPr>
+        <w:t>than checking the server alone</w:t>
+      </w:r>
+    </w:p>
+    <w:p>
+      <w:pPr>
+        <w:rPr>
+          <w:b w:val="0"/>
+          <w:bCs w:val="0"/>
+        </w:rPr>
+      </w:pPr>
+      <w:r>
+        <w:rPr>
+          <w:b w:val="1"/>
+          <w:bCs w:val="1"/>
         </w:rPr>
         <w:t xml:space="preserve">Deliverable: </w:t>
       </w:r>
-    </w:p>
-    <w:p>
-      <w:r>
-        <w:rPr>
-          <w:b/>
-          <w:bCs/>
+      <w:r>
+        <w:rPr>
+          <w:b w:val="0"/>
+          <w:bCs w:val="0"/>
+        </w:rPr>
+        <w:t>The /</w:t>
+      </w:r>
+      <w:r>
+        <w:rPr>
+          <w:b w:val="0"/>
+          <w:bCs w:val="0"/>
+        </w:rPr>
+        <w:t>api</w:t>
+      </w:r>
+      <w:r>
+        <w:rPr>
+          <w:b w:val="0"/>
+          <w:bCs w:val="0"/>
+        </w:rPr>
+        <w:t xml:space="preserve">/health route </w:t>
+      </w:r>
+      <w:r>
+        <w:rPr>
+          <w:b w:val="0"/>
+          <w:bCs w:val="0"/>
+        </w:rPr>
+        <w:t>is live</w:t>
+      </w:r>
+      <w:r>
+        <w:rPr>
+          <w:b w:val="0"/>
+          <w:bCs w:val="0"/>
+        </w:rPr>
+        <w:t xml:space="preserve"> and committed to the codebase. It returns “success” when the database connection is active and “error” when t</w:t>
+      </w:r>
+      <w:r>
+        <w:rPr>
+          <w:b w:val="0"/>
+          <w:bCs w:val="0"/>
+        </w:rPr>
+        <w:t>he database is not connected. All a</w:t>
+      </w:r>
+      <w:r>
+        <w:rPr>
+          <w:b w:val="0"/>
+          <w:bCs w:val="0"/>
+        </w:rPr>
+        <w:t xml:space="preserve">ssociated </w:t>
+      </w:r>
+      <w:r>
+        <w:rPr>
+          <w:b w:val="0"/>
+          <w:bCs w:val="0"/>
+        </w:rPr>
+        <w:t>tests run successfully.</w:t>
+      </w:r>
+    </w:p>
+    <w:p>
+      <w:pPr>
+        <w:rPr>
+          <w:b w:val="1"/>
+          <w:bCs w:val="1"/>
+        </w:rPr>
+      </w:pPr>
+      <w:r>
+        <w:rPr>
+          <w:b w:val="1"/>
+          <w:bCs w:val="1"/>
         </w:rPr>
         <w:t xml:space="preserve">Note for next role: </w:t>
       </w:r>
-    </w:p>
-    <w:p/>
+      <w:r>
+        <w:rPr>
+          <w:b w:val="1"/>
+          <w:bCs w:val="1"/>
+        </w:rPr>
+        <w:t>D</w:t>
+      </w:r>
+      <w:r>
+        <w:rPr>
+          <w:b w:val="0"/>
+          <w:bCs w:val="0"/>
+        </w:rPr>
+        <w:t xml:space="preserve">evelopers can call this endpoint to </w:t>
+      </w:r>
+      <w:r>
+        <w:rPr>
+          <w:b w:val="0"/>
+          <w:bCs w:val="0"/>
+        </w:rPr>
+        <w:t>determine</w:t>
+      </w:r>
+      <w:r>
+        <w:rPr>
+          <w:b w:val="0"/>
+          <w:bCs w:val="0"/>
+        </w:rPr>
+        <w:t xml:space="preserve"> whether the entire system, including both</w:t>
+      </w:r>
+      <w:r>
+        <w:rPr>
+          <w:b w:val="0"/>
+          <w:bCs w:val="0"/>
+        </w:rPr>
+        <w:t xml:space="preserve"> the server and database, is operational</w:t>
+      </w:r>
+    </w:p>
     <w:p>
       <w:pPr>
         <w:pStyle w:val="Heading2"/>
@@ -3298,8 +3557,8 @@
       <w:pgMar w:top="1440" w:right="1440" w:bottom="1440" w:left="1440" w:header="708" w:footer="708" w:gutter="0"/>
       <w:cols w:space="720"/>
       <w:docGrid w:linePitch="360"/>
-      <w:headerReference w:type="default" r:id="Rc3b7216ffd00417d"/>
-      <w:footerReference w:type="default" r:id="R37b1f0dc8de24f76"/>
+      <w:headerReference w:type="default" r:id="Rbc20d24e521348e5"/>
+      <w:footerReference w:type="default" r:id="R75700b705c2e4c35"/>
     </w:sectPr>
   </w:body>
 </w:document>
@@ -4153,7 +4412,7 @@
     <w:name w:val="header"/>
     <w:basedOn w:val="Normal"/>
     <w:unhideWhenUsed/>
-    <w:rsid w:val="1BFA8424"/>
+    <w:rsid w:val="2FB7FF72"/>
     <w:pPr>
       <w:tabs>
         <w:tab w:val="center" w:leader="none" w:pos="4680"/>
@@ -4167,7 +4426,7 @@
     <w:name w:val="footer"/>
     <w:basedOn w:val="Normal"/>
     <w:unhideWhenUsed/>
-    <w:rsid w:val="1BFA8424"/>
+    <w:rsid w:val="2FB7FF72"/>
     <w:pPr>
       <w:tabs>
         <w:tab w:val="center" w:leader="none" w:pos="4680"/>

</xml_diff>